<commit_message>
refactor: extractor improvements, PptxGenJS slides, template updates
- pathology/radiology extractors: validation, layer annotations
- tumor_markers: improved parsing and GCIG criteria
- grounded_clinical_note: safe text handling
- clinical_note_filter_utils: shared filter helpers
- PptxGenJS-based PPTX generation (tumor_board_slides.js)
- Updated Word/PPTX templates for 5-column/5-slide layout

Co-Authored-By: Claude Opus 4.6 <noreply@anthropic.com>
</commit_message>
<xml_diff>
--- a/src/scenarios/default/templates/tumor_board_template.docx
+++ b/src/scenarios/default/templates/tumor_board_template.docx
@@ -10,15 +10,37 @@
         <w:tblLook w:firstColumn="1" w:firstRow="1" w:lastColumn="0" w:lastRow="0" w:noHBand="0" w:noVBand="1" w:val="04A0"/>
       </w:tblPr>
       <w:tblGrid>
-        <w:gridCol w:w="3744"/>
-        <w:gridCol w:w="3744"/>
-        <w:gridCol w:w="3744"/>
-        <w:gridCol w:w="3744"/>
+        <w:gridCol w:w="2880"/>
+        <w:gridCol w:w="2880"/>
+        <w:gridCol w:w="2880"/>
+        <w:gridCol w:w="2880"/>
+        <w:gridCol w:w="2880"/>
       </w:tblGrid>
       <w:tr>
         <w:tc>
           <w:tcPr>
-            <w:tcW w:type="dxa" w:w="3744"/>
+            <w:tcW w:type="dxa" w:w="1339"/>
+            <w:tcMar>
+              <w:top w:w="50" w:type="dxa"/>
+              <w:bottom w:w="50" w:type="dxa"/>
+              <w:start w:w="80" w:type="dxa"/>
+              <w:end w:w="80" w:type="dxa"/>
+            </w:tcMar>
+          </w:tcPr>
+          <w:p>
+            <w:r>
+              <w:rPr>
+                <w:rFonts w:ascii="Calibri" w:hAnsi="Calibri"/>
+                <w:b/>
+                <w:sz w:val="20"/>
+              </w:rPr>
+              <w:t>Patient</w:t>
+            </w:r>
+          </w:p>
+        </w:tc>
+        <w:tc>
+          <w:tcPr>
+            <w:tcW w:type="dxa" w:w="2880"/>
             <w:tcMar>
               <w:top w:w="50" w:type="dxa"/>
               <w:bottom w:w="50" w:type="dxa"/>
@@ -39,7 +61,7 @@
         </w:tc>
         <w:tc>
           <w:tcPr>
-            <w:tcW w:type="dxa" w:w="5040"/>
+            <w:tcW w:type="dxa" w:w="4234"/>
             <w:tcMar>
               <w:top w:w="50" w:type="dxa"/>
               <w:bottom w:w="50" w:type="dxa"/>
@@ -60,7 +82,7 @@
         </w:tc>
         <w:tc>
           <w:tcPr>
-            <w:tcW w:type="dxa" w:w="3312"/>
+            <w:tcW w:type="dxa" w:w="4766"/>
             <w:tcMar>
               <w:top w:w="50" w:type="dxa"/>
               <w:bottom w:w="50" w:type="dxa"/>
@@ -81,7 +103,7 @@
         </w:tc>
         <w:tc>
           <w:tcPr>
-            <w:tcW w:type="dxa" w:w="2736"/>
+            <w:tcW w:type="dxa" w:w="1613"/>
             <w:tcMar>
               <w:top w:w="50" w:type="dxa"/>
               <w:bottom w:w="50" w:type="dxa"/>
@@ -104,7 +126,27 @@
       <w:tr>
         <w:tc>
           <w:tcPr>
-            <w:tcW w:type="dxa" w:w="3744"/>
+            <w:tcW w:type="dxa" w:w="1339"/>
+            <w:tcMar>
+              <w:top w:w="50" w:type="dxa"/>
+              <w:bottom w:w="50" w:type="dxa"/>
+              <w:start w:w="80" w:type="dxa"/>
+              <w:end w:w="80" w:type="dxa"/>
+            </w:tcMar>
+          </w:tcPr>
+          <w:p>
+            <w:r>
+              <w:rPr>
+                <w:rFonts w:ascii="Calibri" w:hAnsi="Calibri"/>
+                <w:sz w:val="18"/>
+              </w:rPr>
+              <w:t>{{r col0_content}}</w:t>
+            </w:r>
+          </w:p>
+        </w:tc>
+        <w:tc>
+          <w:tcPr>
+            <w:tcW w:type="dxa" w:w="2880"/>
             <w:tcMar>
               <w:top w:w="50" w:type="dxa"/>
               <w:bottom w:w="50" w:type="dxa"/>
@@ -124,7 +166,7 @@
         </w:tc>
         <w:tc>
           <w:tcPr>
-            <w:tcW w:type="dxa" w:w="5040"/>
+            <w:tcW w:type="dxa" w:w="4234"/>
             <w:tcMar>
               <w:top w:w="50" w:type="dxa"/>
               <w:bottom w:w="50" w:type="dxa"/>
@@ -144,7 +186,7 @@
         </w:tc>
         <w:tc>
           <w:tcPr>
-            <w:tcW w:type="dxa" w:w="3312"/>
+            <w:tcW w:type="dxa" w:w="4766"/>
             <w:tcMar>
               <w:top w:w="50" w:type="dxa"/>
               <w:bottom w:w="50" w:type="dxa"/>
@@ -164,7 +206,7 @@
         </w:tc>
         <w:tc>
           <w:tcPr>
-            <w:tcW w:type="dxa" w:w="2736"/>
+            <w:tcW w:type="dxa" w:w="1613"/>
             <w:tcMar>
               <w:top w:w="50" w:type="dxa"/>
               <w:bottom w:w="50" w:type="dxa"/>
@@ -186,7 +228,7 @@
     </w:tbl>
     <w:sectPr>
       <w:pgSz w:w="15840" w:h="12240" w:orient="landscape"/>
-      <w:pgMar w:top="432" w:right="432" w:bottom="432" w:left="432" w:header="720" w:footer="720" w:gutter="0"/>
+      <w:pgMar w:top="864" w:right="720" w:bottom="720" w:left="720" w:header="720" w:footer="720" w:gutter="0"/>
       <w:cols w:space="720"/>
       <w:docGrid w:linePitch="360"/>
     </w:sectPr>

</xml_diff>